<commit_message>
Feat: Change the logic of the Insertion Sort - No longer need to swap constantly - Use shift as a standard insertion sort
</commit_message>
<xml_diff>
--- a/Ontrack_Files/P2/P2 Report.docx
+++ b/Ontrack_Files/P2/P2 Report.docx
@@ -229,39 +229,37 @@
           <w:sz w:val="32"/>
           <w:szCs w:val="32"/>
         </w:rPr>
-        <w:t>We need to compare [(n-1) + (n-</w:t>
-      </w:r>
-      <w:proofErr w:type="gramStart"/>
-      <w:r>
-        <w:rPr>
-          <w:sz w:val="32"/>
-          <w:szCs w:val="32"/>
-        </w:rPr>
-        <w:t>2)+</w:t>
-      </w:r>
-      <w:proofErr w:type="gramEnd"/>
-      <w:r>
-        <w:rPr>
-          <w:sz w:val="32"/>
-          <w:szCs w:val="32"/>
-        </w:rPr>
-        <w:t xml:space="preserve"> … +1] = (n-</w:t>
-      </w:r>
-      <w:proofErr w:type="gramStart"/>
-      <w:r>
-        <w:rPr>
-          <w:sz w:val="32"/>
-          <w:szCs w:val="32"/>
-        </w:rPr>
-        <w:t>1)*</w:t>
-      </w:r>
-      <w:proofErr w:type="gramEnd"/>
-      <w:r>
-        <w:rPr>
-          <w:sz w:val="32"/>
-          <w:szCs w:val="32"/>
-        </w:rPr>
-        <w:t>n/2 times and we need to swap the same times as that of comparison.</w:t>
+        <w:t xml:space="preserve">We use a temporary variable called </w:t>
+      </w:r>
+      <w:proofErr w:type="spellStart"/>
+      <w:r>
+        <w:rPr>
+          <w:sz w:val="32"/>
+          <w:szCs w:val="32"/>
+        </w:rPr>
+        <w:t>temp_post</w:t>
+      </w:r>
+      <w:proofErr w:type="spellEnd"/>
+      <w:r>
+        <w:rPr>
+          <w:sz w:val="32"/>
+          <w:szCs w:val="32"/>
+        </w:rPr>
+        <w:t xml:space="preserve"> to hold the first unsorted elements in the array. Therefore, we need to read (n-1) times. Then, we need to compare and shift [(n-1) + (n-2) + … + 1] = </w:t>
+      </w:r>
+      <w:r>
+        <w:rPr>
+          <w:sz w:val="32"/>
+          <w:szCs w:val="32"/>
+        </w:rPr>
+        <w:t>(n-1) *n/2 times</w:t>
+      </w:r>
+      <w:r>
+        <w:rPr>
+          <w:sz w:val="32"/>
+          <w:szCs w:val="32"/>
+        </w:rPr>
+        <w:t>.</w:t>
       </w:r>
     </w:p>
     <w:p>
@@ -292,11 +290,12 @@
           <w:sz w:val="32"/>
           <w:szCs w:val="32"/>
         </w:rPr>
+        <w:lastRenderedPageBreak/>
         <w:drawing>
-          <wp:inline distT="0" distB="0" distL="0" distR="0" wp14:anchorId="2AF007FD" wp14:editId="27D9E832">
-            <wp:extent cx="3035300" cy="520700"/>
+          <wp:inline distT="0" distB="0" distL="0" distR="0" wp14:anchorId="63CB8698" wp14:editId="58FF7458">
+            <wp:extent cx="3924300" cy="546100"/>
             <wp:effectExtent l="0" t="0" r="0" b="0"/>
-            <wp:docPr id="1920276665" name="Picture 2"/>
+            <wp:docPr id="1604353335" name="Picture 1"/>
             <wp:cNvGraphicFramePr>
               <a:graphicFrameLocks xmlns:a="http://schemas.openxmlformats.org/drawingml/2006/main" noChangeAspect="1"/>
             </wp:cNvGraphicFramePr>
@@ -304,7 +303,7 @@
               <a:graphicData uri="http://schemas.openxmlformats.org/drawingml/2006/picture">
                 <pic:pic xmlns:pic="http://schemas.openxmlformats.org/drawingml/2006/picture">
                   <pic:nvPicPr>
-                    <pic:cNvPr id="1920276665" name="Picture 1920276665"/>
+                    <pic:cNvPr id="1604353335" name="Picture 1604353335"/>
                     <pic:cNvPicPr/>
                   </pic:nvPicPr>
                   <pic:blipFill>
@@ -322,7 +321,7 @@
                   <pic:spPr>
                     <a:xfrm>
                       <a:off x="0" y="0"/>
-                      <a:ext cx="3035300" cy="520700"/>
+                      <a:ext cx="3924300" cy="546100"/>
                     </a:xfrm>
                     <a:prstGeom prst="rect">
                       <a:avLst/>
@@ -342,12 +341,19 @@
           <w:szCs w:val="32"/>
         </w:rPr>
       </w:pPr>
-      <w:r>
-        <w:rPr>
-          <w:sz w:val="32"/>
-          <w:szCs w:val="32"/>
-        </w:rPr>
-        <w:lastRenderedPageBreak/>
+    </w:p>
+    <w:p>
+      <w:pPr>
+        <w:rPr>
+          <w:sz w:val="32"/>
+          <w:szCs w:val="32"/>
+        </w:rPr>
+      </w:pPr>
+      <w:r>
+        <w:rPr>
+          <w:sz w:val="32"/>
+          <w:szCs w:val="32"/>
+        </w:rPr>
         <w:t>For Bubble sort,</w:t>
       </w:r>
     </w:p>
@@ -379,14 +385,7 @@
           <w:sz w:val="32"/>
           <w:szCs w:val="32"/>
         </w:rPr>
-        <w:t xml:space="preserve">n times and We need to swap </w:t>
-      </w:r>
-      <w:r>
-        <w:rPr>
-          <w:sz w:val="32"/>
-          <w:szCs w:val="32"/>
-        </w:rPr>
-        <w:t>[(n-1) + (n-</w:t>
+        <w:t>n times and We need to swap [(n-1) + (n-</w:t>
       </w:r>
       <w:proofErr w:type="gramStart"/>
       <w:r>
@@ -418,14 +417,7 @@
           <w:sz w:val="32"/>
           <w:szCs w:val="32"/>
         </w:rPr>
-        <w:t>n/2 times</w:t>
-      </w:r>
-      <w:r>
-        <w:rPr>
-          <w:sz w:val="32"/>
-          <w:szCs w:val="32"/>
-        </w:rPr>
-        <w:t>.</w:t>
+        <w:t>n/2 times.</w:t>
       </w:r>
     </w:p>
     <w:p>
@@ -558,56 +550,9 @@
           <w:sz w:val="32"/>
           <w:szCs w:val="32"/>
         </w:rPr>
+        <w:lastRenderedPageBreak/>
         <w:drawing>
-          <wp:inline distT="0" distB="0" distL="0" distR="0" wp14:anchorId="0C1ACB40" wp14:editId="01F495EA">
-            <wp:extent cx="3632200" cy="1955800"/>
-            <wp:effectExtent l="0" t="0" r="0" b="0"/>
-            <wp:docPr id="850584719" name="Picture 4"/>
-            <wp:cNvGraphicFramePr>
-              <a:graphicFrameLocks xmlns:a="http://schemas.openxmlformats.org/drawingml/2006/main" noChangeAspect="1"/>
-            </wp:cNvGraphicFramePr>
-            <a:graphic xmlns:a="http://schemas.openxmlformats.org/drawingml/2006/main">
-              <a:graphicData uri="http://schemas.openxmlformats.org/drawingml/2006/picture">
-                <pic:pic xmlns:pic="http://schemas.openxmlformats.org/drawingml/2006/picture">
-                  <pic:nvPicPr>
-                    <pic:cNvPr id="850584719" name="Picture 850584719"/>
-                    <pic:cNvPicPr/>
-                  </pic:nvPicPr>
-                  <pic:blipFill>
-                    <a:blip r:embed="rId7">
-                      <a:extLst>
-                        <a:ext uri="{28A0092B-C50C-407E-A947-70E740481C1C}">
-                          <a14:useLocalDpi xmlns:a14="http://schemas.microsoft.com/office/drawing/2010/main" val="0"/>
-                        </a:ext>
-                      </a:extLst>
-                    </a:blip>
-                    <a:stretch>
-                      <a:fillRect/>
-                    </a:stretch>
-                  </pic:blipFill>
-                  <pic:spPr>
-                    <a:xfrm>
-                      <a:off x="0" y="0"/>
-                      <a:ext cx="3632200" cy="1955800"/>
-                    </a:xfrm>
-                    <a:prstGeom prst="rect">
-                      <a:avLst/>
-                    </a:prstGeom>
-                  </pic:spPr>
-                </pic:pic>
-              </a:graphicData>
-            </a:graphic>
-          </wp:inline>
-        </w:drawing>
-      </w:r>
-      <w:r>
-        <w:rPr>
-          <w:noProof/>
-          <w:sz w:val="32"/>
-          <w:szCs w:val="32"/>
-        </w:rPr>
-        <w:drawing>
-          <wp:inline distT="0" distB="0" distL="0" distR="0" wp14:anchorId="0980570D" wp14:editId="3B21122A">
+          <wp:inline distT="0" distB="0" distL="0" distR="0" wp14:anchorId="0980570D" wp14:editId="0BE4838F">
             <wp:extent cx="5524500" cy="2209800"/>
             <wp:effectExtent l="0" t="0" r="0" b="0"/>
             <wp:docPr id="1928967554" name="Picture 5"/>
@@ -622,7 +567,7 @@
                     <pic:cNvPicPr/>
                   </pic:nvPicPr>
                   <pic:blipFill>
-                    <a:blip r:embed="rId8">
+                    <a:blip r:embed="rId7">
                       <a:extLst>
                         <a:ext uri="{28A0092B-C50C-407E-A947-70E740481C1C}">
                           <a14:useLocalDpi xmlns:a14="http://schemas.microsoft.com/office/drawing/2010/main" val="0"/>
@@ -648,6 +593,110 @@
           </wp:inline>
         </w:drawing>
       </w:r>
+      <w:r>
+        <w:rPr>
+          <w:noProof/>
+          <w:sz w:val="32"/>
+          <w:szCs w:val="32"/>
+        </w:rPr>
+        <w:drawing>
+          <wp:inline distT="0" distB="0" distL="0" distR="0" wp14:anchorId="11CE691F" wp14:editId="3CECE15D">
+            <wp:extent cx="5588000" cy="2235200"/>
+            <wp:effectExtent l="0" t="0" r="0" b="0"/>
+            <wp:docPr id="1076065539" name="Picture 2"/>
+            <wp:cNvGraphicFramePr>
+              <a:graphicFrameLocks xmlns:a="http://schemas.openxmlformats.org/drawingml/2006/main" noChangeAspect="1"/>
+            </wp:cNvGraphicFramePr>
+            <a:graphic xmlns:a="http://schemas.openxmlformats.org/drawingml/2006/main">
+              <a:graphicData uri="http://schemas.openxmlformats.org/drawingml/2006/picture">
+                <pic:pic xmlns:pic="http://schemas.openxmlformats.org/drawingml/2006/picture">
+                  <pic:nvPicPr>
+                    <pic:cNvPr id="1076065539" name="Picture 1076065539"/>
+                    <pic:cNvPicPr/>
+                  </pic:nvPicPr>
+                  <pic:blipFill>
+                    <a:blip r:embed="rId8">
+                      <a:extLst>
+                        <a:ext uri="{28A0092B-C50C-407E-A947-70E740481C1C}">
+                          <a14:useLocalDpi xmlns:a14="http://schemas.microsoft.com/office/drawing/2010/main" val="0"/>
+                        </a:ext>
+                      </a:extLst>
+                    </a:blip>
+                    <a:stretch>
+                      <a:fillRect/>
+                    </a:stretch>
+                  </pic:blipFill>
+                  <pic:spPr>
+                    <a:xfrm>
+                      <a:off x="0" y="0"/>
+                      <a:ext cx="5588000" cy="2235200"/>
+                    </a:xfrm>
+                    <a:prstGeom prst="rect">
+                      <a:avLst/>
+                    </a:prstGeom>
+                  </pic:spPr>
+                </pic:pic>
+              </a:graphicData>
+            </a:graphic>
+          </wp:inline>
+        </w:drawing>
+      </w:r>
+    </w:p>
+    <w:p>
+      <w:pPr>
+        <w:rPr>
+          <w:sz w:val="32"/>
+          <w:szCs w:val="32"/>
+        </w:rPr>
+      </w:pPr>
+      <w:r>
+        <w:rPr>
+          <w:noProof/>
+          <w:sz w:val="32"/>
+          <w:szCs w:val="32"/>
+        </w:rPr>
+        <w:drawing>
+          <wp:inline distT="0" distB="0" distL="0" distR="0" wp14:anchorId="79CF03CA" wp14:editId="19DFCF01">
+            <wp:extent cx="5689600" cy="2286000"/>
+            <wp:effectExtent l="0" t="0" r="0" b="0"/>
+            <wp:docPr id="122326396" name="Picture 3"/>
+            <wp:cNvGraphicFramePr>
+              <a:graphicFrameLocks xmlns:a="http://schemas.openxmlformats.org/drawingml/2006/main" noChangeAspect="1"/>
+            </wp:cNvGraphicFramePr>
+            <a:graphic xmlns:a="http://schemas.openxmlformats.org/drawingml/2006/main">
+              <a:graphicData uri="http://schemas.openxmlformats.org/drawingml/2006/picture">
+                <pic:pic xmlns:pic="http://schemas.openxmlformats.org/drawingml/2006/picture">
+                  <pic:nvPicPr>
+                    <pic:cNvPr id="122326396" name="Picture 122326396"/>
+                    <pic:cNvPicPr/>
+                  </pic:nvPicPr>
+                  <pic:blipFill>
+                    <a:blip r:embed="rId9">
+                      <a:extLst>
+                        <a:ext uri="{28A0092B-C50C-407E-A947-70E740481C1C}">
+                          <a14:useLocalDpi xmlns:a14="http://schemas.microsoft.com/office/drawing/2010/main" val="0"/>
+                        </a:ext>
+                      </a:extLst>
+                    </a:blip>
+                    <a:stretch>
+                      <a:fillRect/>
+                    </a:stretch>
+                  </pic:blipFill>
+                  <pic:spPr>
+                    <a:xfrm>
+                      <a:off x="0" y="0"/>
+                      <a:ext cx="5689600" cy="2286000"/>
+                    </a:xfrm>
+                    <a:prstGeom prst="rect">
+                      <a:avLst/>
+                    </a:prstGeom>
+                  </pic:spPr>
+                </pic:pic>
+              </a:graphicData>
+            </a:graphic>
+          </wp:inline>
+        </w:drawing>
+      </w:r>
     </w:p>
     <w:p>
       <w:pPr>
@@ -668,7 +717,14 @@
           <w:sz w:val="32"/>
           <w:szCs w:val="32"/>
         </w:rPr>
-        <w:t>185.</w:t>
+        <w:t>203</w:t>
+      </w:r>
+      <w:r>
+        <w:rPr>
+          <w:sz w:val="32"/>
+          <w:szCs w:val="32"/>
+        </w:rPr>
+        <w:t>.</w:t>
       </w:r>
     </w:p>
     <w:sectPr>

</xml_diff>